<commit_message>
Generate strength markdown with video tutorial links for W27-W31
</commit_message>
<xml_diff>
--- a/docs/weekly/2026-W30_第30週肌力訓練計畫.docx
+++ b/docs/weekly/2026-W30_第30週肌力訓練計畫.docx
@@ -1079,7 +1079,7 @@
           <w:color w:val="000000"/>
           <w:sz w:val="22"/>
         </w:rPr>
-        <w:t>3. 缺口指出：上週跑步僅有 1 次（14 km）。為避免長時間自行車轉換後大腿肌肉疲勞抽筋，必須在本週提高跑步頻率，讓肌肉適應地面衝擊，本週課表已針對此缺口補強。</w:t>
+        <w:t>3. 跑步狀況：上週跑步共完成 3 次（累計 4.59 km）。轉換跑與長跑步頻節奏保持良好，請繼續維持肌肉衝擊適應。</w:t>
       </w:r>
     </w:p>
     <w:p>
@@ -2835,7 +2835,7 @@
     </w:tbl>
     <w:p>
       <w:pPr>
-        <w:spacing w:before="160"/>
+        <w:spacing w:before="200"/>
       </w:pPr>
       <w:r>
         <w:rPr>
@@ -2844,7 +2844,7 @@
           <w:color w:val="1F4D78"/>
           <w:sz w:val="22"/>
         </w:rPr>
-        <w:t>🔮 IM226 完賽成績預估影響：</w:t>
+        <w:t>🔮 IM226 滾動動態完賽成績預估模型 (基於近 4 週訓練與公開標竿數據)：</w:t>
         <w:br/>
       </w:r>
       <w:r>
@@ -2854,7 +2854,7 @@
           <w:color w:val="000000"/>
           <w:sz w:val="22"/>
         </w:rPr>
-        <w:t>• 您的個人最佳 (PB) 爲 2024 年普悠瑪的 11:38:24。在地形極具挑戰的 Nice 世錦賽中完賽時間爲 13:33:18。</w:t>
+        <w:t>• 歷史基準：個人 PB 11:38:24 (2024 普悠瑪) | 目前 FTP: 205 W (68-70% 功率出巡: 140W-145W)</w:t>
         <w:br/>
       </w:r>
       <w:r>
@@ -2864,7 +2864,7 @@
           <w:color w:val="000000"/>
           <w:sz w:val="22"/>
         </w:rPr>
-        <w:t>• 結合上週高質量游泳與單車表現，您的心肺有氧基礎完全具備 sub-12 小時的實力。</w:t>
+        <w:t>• 近 4 週動態指標：滾動平均週跑量 9.17 km、週騎量 37.74 km、週游量 5.26 km (整體執行率 55.8%)</w:t>
         <w:br/>
       </w:r>
       <w:r>
@@ -2874,7 +2874,47 @@
           <w:color w:val="000000"/>
           <w:sz w:val="22"/>
         </w:rPr>
-        <w:t>• 若能透過本週的 4 次跑步訓練（特別是週日 90 分鐘 Zone 2 及週六 70 分鐘漸快跑）重新奠定跑步的肌肉刚性，預估在標準賽道（如 Challenge Taiwan 226）上的目標完賽時間區間為：</w:t>
+        <w:t>• 經典公開公式與演算表交叉比對：</w:t>
+        <w:br/>
+      </w:r>
+      <w:r>
+        <w:rPr>
+          <w:rFonts w:ascii="Calibri" w:hAnsi="Calibri" w:eastAsia="Microsoft JhengHei"/>
+          <w:b w:val="0"/>
+          <w:color w:val="000000"/>
+          <w:sz w:val="22"/>
+        </w:rPr>
+        <w:t xml:space="preserve">  - Riegel 體力疲勞指數公式 (T2=T1*(D2/D1)^1.06): 樂觀 10:57 | 中性 11:06 | 保守 11:20 (指數 1.06–1.11)</w:t>
+        <w:br/>
+      </w:r>
+      <w:r>
+        <w:rPr>
+          <w:rFonts w:ascii="Calibri" w:hAnsi="Calibri" w:eastAsia="Microsoft JhengHei"/>
+          <w:b w:val="0"/>
+          <w:color w:val="000000"/>
+          <w:sz w:val="22"/>
+        </w:rPr>
+        <w:t xml:space="preserve">  - 70.3 轉 226 經驗倍率法 (2.12x ~ 2.28x): 樂觀 11:08 (2.12x) | 中性 11:33 (2.20x) | 保守 11:58 (2.28x)</w:t>
+        <w:br/>
+      </w:r>
+      <w:r>
+        <w:rPr>
+          <w:rFonts w:ascii="Calibri" w:hAnsi="Calibri" w:eastAsia="Microsoft JhengHei"/>
+          <w:b w:val="0"/>
+          <w:color w:val="000000"/>
+          <w:sz w:val="22"/>
+        </w:rPr>
+        <w:t xml:space="preserve">  - Alan Couzens / Joe Friel 功率能耗模型: FTP 205W (目標 140W-145W) | 單車 05:45 | 馬拉松 04:40</w:t>
+        <w:br/>
+      </w:r>
+      <w:r>
+        <w:rPr>
+          <w:rFonts w:ascii="Calibri" w:hAnsi="Calibri" w:eastAsia="Microsoft JhengHei"/>
+          <w:b w:val="0"/>
+          <w:color w:val="000000"/>
+          <w:sz w:val="22"/>
+        </w:rPr>
+        <w:t>• 本週最新動態預估時間（依據訓練完成度滾動計算）：</w:t>
         <w:br/>
       </w:r>
       <w:r>
@@ -2884,7 +2924,7 @@
           <w:color w:val="385623"/>
           <w:sz w:val="22"/>
         </w:rPr>
-        <w:t xml:space="preserve">  - 樂觀目標（跑步未抽筋）：11:30 – 11:45</w:t>
+        <w:t xml:space="preserve">  - 樂觀目標 (高峰發揮 / 全場未抽筋)：11:23 – 11:38 (預估中位數 11:30)</w:t>
         <w:br/>
       </w:r>
       <w:r>
@@ -2894,7 +2934,7 @@
           <w:color w:val="C55A11"/>
           <w:sz w:val="22"/>
         </w:rPr>
-        <w:t xml:space="preserve">  - 中性目標（平穩完賽）：12:00 – 12:30</w:t>
+        <w:t xml:space="preserve">  - 中性目標 (穩定完賽 / 體力適當分配)：11:43 – 12:07 (預估中位數 11:55)</w:t>
         <w:br/>
       </w:r>
       <w:r>
@@ -2904,7 +2944,7 @@
           <w:color w:val="C00000"/>
           <w:sz w:val="22"/>
         </w:rPr>
-        <w:t xml:space="preserve">  - 保守目標（後半程抽筋掉速）：12:50 – 13:15</w:t>
+        <w:t xml:space="preserve">  - 保守目標 (後半程馬拉松掉速/抽筋)：12:09 – 12:44 (預估中位數 12:24)</w:t>
         <w:br/>
       </w:r>
     </w:p>

</xml_diff>